<commit_message>
fix(aan): sync Vol VII Book 05 derivatives + status table to the refreshed Date Codes
The derivative-freshness and status-drift gates caught the two
downstream artifacts of the Phase 0 scrub's Date Code refresh, exactly
as designed:

- decks/Vol_VII_Book_05.yaml date_code synced to the qmd (spec section 1),
  then the tracked .pptx regenerated via `uiao generate aan-deck` and the
  tracked .docx re-rendered via `quarto render --to docx` — all 24
  tracked derivative pairs now carry their source's Date Code.
- docs/data/customer-documents-status.md regenerated (frontmatter dates
  feed the derived status table).

Co-Authored-By: Claude Fable 5 <noreply@anthropic.com>
</commit_message>
<xml_diff>
--- a/docs/customer-documents/federal-aan-series/Vol_VII_Book_05_FedAAN_ServiceNow_Compliance_App.docx
+++ b/docs/customer-documents/federal-aan-series/Vol_VII_Book_05_FedAAN_ServiceNow_Compliance_App.docx
@@ -23,7 +23,7 @@
         <w:pStyle w:val="Author"/>
       </w:pPr>
       <w:r>
-        <w:t xml:space="preserve">SSA Cloud Services Team</w:t>
+        <w:t xml:space="preserve">Federal Cloud Services</w:t>
       </w:r>
     </w:p>
     <w:p>
@@ -31,24 +31,42 @@
         <w:pStyle w:val="Date"/>
       </w:pPr>
       <w:r>
-        <w:t xml:space="preserve">2026-07-14 11:56 ET</w:t>
-      </w:r>
-    </w:p>
-    <w:p>
-      <w:pPr>
-        <w:pStyle w:val="FouoBanner"/>
-      </w:pPr>
-      <w:r>
-        <w:t xml:space="preserve">INTERNAL — NOT FOR PUBLIC DISTRIBUTION</w:t>
-      </w:r>
-    </w:p>
+        <w:t xml:space="preserve">Invalid Date</w:t>
+      </w:r>
+    </w:p>
+    <w:sdt>
+      <w:sdtPr>
+        <w:docPartObj>
+          <w:docPartGallery w:val="Table of Contents"/>
+          <w:docPartUnique/>
+        </w:docPartObj>
+      </w:sdtPr>
+      <w:sdtContent>
+        <w:p>
+          <w:pPr>
+            <w:pStyle w:val="TOCHeading"/>
+          </w:pPr>
+          <w:r>
+            <w:t xml:space="preserve">Table of contents</w:t>
+          </w:r>
+        </w:p>
+        <w:p>
+          <w:r>
+            <w:fldChar w:fldCharType="begin" w:dirty="true"/>
+            <w:instrText xml:space="preserve">TOC \o "1-3" \h \z \u</w:instrText>
+            <w:fldChar w:fldCharType="separate"/>
+            <w:fldChar w:fldCharType="end"/>
+          </w:r>
+        </w:p>
+      </w:sdtContent>
+    </w:sdt>
     <w:bookmarkStart w:id="9" w:name="draft-proposal-subject-to-review"/>
     <w:p>
       <w:pPr>
         <w:pStyle w:val="Heading2"/>
       </w:pPr>
       <w:r>
-        <w:t xml:space="preserve">Draft Proposal — Subject to Review</w:t>
+        <w:t xml:space="preserve">0.1 Draft Proposal — Subject to Review</w:t>
       </w:r>
     </w:p>
     <w:p>
@@ -69,7 +87,7 @@
         <w:t xml:space="preserve">CSI Team (Cloud Services Infrastructure)</w:t>
       </w:r>
       <w:r>
-        <w:t xml:space="preserve">; not yet reviewed or approved by the SSA CIO Office, OIS, or leadership.</w:t>
+        <w:t xml:space="preserve">; not yet reviewed or approved by the Agency CIO Office, OIS, or leadership.</w:t>
       </w:r>
       <w:r>
         <w:t xml:space="preserve"> </w:t>
@@ -85,7 +103,7 @@
         <w:t xml:space="preserve"> </w:t>
       </w:r>
       <w:r>
-        <w:t xml:space="preserve">2026-07-14 11:56 ET</w:t>
+        <w:t xml:space="preserve">2026-07-18 00:33 ET</w:t>
       </w:r>
     </w:p>
     <w:bookmarkEnd w:id="9"/>
@@ -154,7 +172,7 @@
         <w:pStyle w:val="Heading1"/>
       </w:pPr>
       <w:r>
-        <w:t xml:space="preserve">What This Document Addresses</w:t>
+        <w:t xml:space="preserve">1. What This Document Addresses</w:t>
       </w:r>
     </w:p>
     <w:p>
@@ -206,7 +224,7 @@
           <w:rPr>
             <w:rStyle w:val="VerbatimChar"/>
           </w:rPr>
-          <w:t xml:space="preserve">x_ssa_fed_compliance/</w:t>
+          <w:t xml:space="preserve">x_fed_compliance/</w:t>
         </w:r>
       </w:hyperlink>
       <w:r>
@@ -250,7 +268,7 @@
         <w:pStyle w:val="Heading1"/>
       </w:pPr>
       <w:r>
-        <w:t xml:space="preserve">App Record Model</w:t>
+        <w:t xml:space="preserve">2. App Record Model</w:t>
       </w:r>
     </w:p>
     <w:p>
@@ -267,7 +285,7 @@
         <w:rPr>
           <w:rStyle w:val="VerbatimChar"/>
         </w:rPr>
-        <w:t xml:space="preserve">x_ssa_fed_compliance</w:t>
+        <w:t xml:space="preserve">x_fed_compliance</w:t>
       </w:r>
       <w:r>
         <w:t xml:space="preserve">. Its records implement the five-step loop (test → detect → raise → actuate-native → close+evidence) as reusable ServiceNow building blocks.</w:t>
@@ -835,63 +853,93 @@
         </w:tc>
       </w:tr>
     </w:tbl>
-    <w:bookmarkStart w:id="15" w:name="fig-vol7b05-app"/>
-    <w:p>
-      <w:pPr>
-        <w:pStyle w:val="CaptionedFigure"/>
-      </w:pPr>
-      <w:r>
-        <w:drawing>
-          <wp:inline>
-            <wp:extent cx="5334000" cy="3000375"/>
-            <wp:effectExtent b="0" l="0" r="0" t="0"/>
-            <wp:docPr descr="The scoped-app record model — Catalog/Flow triggers the Script Includes; connectors reach M365 and Azure through an in-boundary MID Server; the reconcile binds to IPAM/DDI and tasks feed IRM/attestation" title="" id="13" name="Picture"/>
-            <a:graphic>
-              <a:graphicData uri="http://schemas.openxmlformats.org/drawingml/2006/picture">
-                <pic:pic>
-                  <pic:nvPicPr>
-                    <pic:cNvPr descr="figs/vol7b05-fig-01-app-record-model.png" id="14" name="Picture"/>
-                    <pic:cNvPicPr>
-                      <a:picLocks noChangeArrowheads="1" noChangeAspect="1"/>
-                    </pic:cNvPicPr>
-                  </pic:nvPicPr>
-                  <pic:blipFill>
-                    <a:blip r:embed="rId12"/>
-                    <a:stretch>
-                      <a:fillRect/>
-                    </a:stretch>
-                  </pic:blipFill>
-                  <pic:spPr bwMode="auto">
-                    <a:xfrm>
-                      <a:off x="0" y="0"/>
-                      <a:ext cx="5334000" cy="3000375"/>
-                    </a:xfrm>
-                    <a:prstGeom prst="rect">
-                      <a:avLst/>
-                    </a:prstGeom>
-                    <a:noFill/>
-                    <a:ln w="9525">
-                      <a:noFill/>
-                      <a:headEnd/>
-                      <a:tailEnd/>
-                    </a:ln>
-                  </pic:spPr>
-                </pic:pic>
-              </a:graphicData>
-            </a:graphic>
-          </wp:inline>
-        </w:drawing>
-      </w:r>
-    </w:p>
-    <w:p>
-      <w:pPr>
-        <w:pStyle w:val="ImageCaption"/>
-      </w:pPr>
-      <w:r>
-        <w:t xml:space="preserve">The scoped-app record model — Catalog/Flow triggers the Script Includes; connectors reach M365 and Azure through an in-boundary MID Server; the reconcile binds to IPAM/DDI and tasks feed IRM/attestation</w:t>
-      </w:r>
-    </w:p>
-    <w:bookmarkEnd w:id="15"/>
+    <w:p>
+      <w:pPr>
+        <w:pStyle w:val="BodyText"/>
+      </w:pPr>
+      <w:r>
+        <w:t xml:space="preserve"> </w:t>
+      </w:r>
+    </w:p>
+    <w:tbl>
+      <w:tblPr>
+        <w:tblStyle w:val="Table"/>
+        <w:tblW w:type="pct" w:w="5000"/>
+        <w:tblLayout w:type="fixed"/>
+        <w:tblLook w:firstRow="0" w:lastRow="0" w:firstColumn="0" w:lastColumn="0" w:noHBand="0" w:noVBand="0" w:val="0000"/>
+      </w:tblPr>
+      <w:tblGrid>
+        <w:gridCol w:w="7920"/>
+      </w:tblGrid>
+      <w:tr>
+        <w:tc>
+          <w:tcPr/>
+          <w:bookmarkStart w:id="15" w:name="fig-vol7b05-app"/>
+          <w:p>
+            <w:pPr>
+              <w:pStyle w:val="Compact"/>
+              <w:jc w:val="center"/>
+            </w:pPr>
+            <w:r>
+              <w:drawing>
+                <wp:inline>
+                  <wp:extent cx="5334000" cy="3000375"/>
+                  <wp:effectExtent b="0" l="0" r="0" t="0"/>
+                  <wp:docPr descr="" title="" id="13" name="Picture"/>
+                  <a:graphic>
+                    <a:graphicData uri="http://schemas.openxmlformats.org/drawingml/2006/picture">
+                      <pic:pic>
+                        <pic:nvPicPr>
+                          <pic:cNvPr descr="figs/vol7b05-fig-01-app-record-model.png" id="14" name="Picture"/>
+                          <pic:cNvPicPr>
+                            <a:picLocks noChangeArrowheads="1" noChangeAspect="1"/>
+                          </pic:cNvPicPr>
+                        </pic:nvPicPr>
+                        <pic:blipFill>
+                          <a:blip r:embed="rId12"/>
+                          <a:stretch>
+                            <a:fillRect/>
+                          </a:stretch>
+                        </pic:blipFill>
+                        <pic:spPr bwMode="auto">
+                          <a:xfrm>
+                            <a:off x="0" y="0"/>
+                            <a:ext cx="5334000" cy="3000375"/>
+                          </a:xfrm>
+                          <a:prstGeom prst="rect">
+                            <a:avLst/>
+                          </a:prstGeom>
+                          <a:noFill/>
+                          <a:ln w="9525">
+                            <a:noFill/>
+                            <a:headEnd/>
+                            <a:tailEnd/>
+                          </a:ln>
+                        </pic:spPr>
+                      </pic:pic>
+                    </a:graphicData>
+                  </a:graphic>
+                </wp:inline>
+              </w:drawing>
+            </w:r>
+          </w:p>
+          <w:p>
+            <w:pPr>
+              <w:jc w:val="center"/>
+            </w:pPr>
+            <w:pPr>
+              <w:jc w:val="left"/>
+              <w:spacing w:before="200"/>
+              <w:pStyle w:val="ImageCaption"/>
+            </w:pPr>
+            <w:r>
+              <w:t xml:space="preserve">Figure 1: The scoped-app record model — Catalog/Flow triggers the Script Includes; connectors reach M365 and Azure through an in-boundary MID Server; the reconcile binds to IPAM/DDI and tasks feed IRM/attestation</w:t>
+            </w:r>
+          </w:p>
+          <w:bookmarkEnd w:id="15"/>
+        </w:tc>
+      </w:tr>
+    </w:tbl>
     <w:bookmarkEnd w:id="16"/>
     <w:bookmarkStart w:id="17" w:name="connectors-prerequisites"/>
     <w:p>
@@ -899,7 +947,7 @@
         <w:pStyle w:val="Heading1"/>
       </w:pPr>
       <w:r>
-        <w:t xml:space="preserve">Connectors &amp; Prerequisites</w:t>
+        <w:t xml:space="preserve">3. Connectors &amp; Prerequisites</w:t>
       </w:r>
     </w:p>
     <w:p>
@@ -1035,7 +1083,7 @@
         <w:pStyle w:val="Heading1"/>
       </w:pPr>
       <w:r>
-        <w:t xml:space="preserve">Import &amp; Wire-Up</w:t>
+        <w:t xml:space="preserve">4. Import &amp; Wire-Up</w:t>
       </w:r>
     </w:p>
     <w:p>
@@ -1056,7 +1104,7 @@
         <w:rPr>
           <w:rStyle w:val="VerbatimChar"/>
         </w:rPr>
-        <w:t xml:space="preserve">x_ssa_fed_compliance</w:t>
+        <w:t xml:space="preserve">x_fed_compliance</w:t>
       </w:r>
       <w:r>
         <w:t xml:space="preserve"> </w:t>
@@ -1134,7 +1182,7 @@
         <w:rPr>
           <w:rStyle w:val="VerbatimChar"/>
         </w:rPr>
-        <w:t xml:space="preserve">x_ssa_fed_compliance.graph</w:t>
+        <w:t xml:space="preserve">x_fed_compliance.graph</w:t>
       </w:r>
       <w:r>
         <w:t xml:space="preserve"> </w:t>
@@ -1149,7 +1197,7 @@
         <w:rPr>
           <w:rStyle w:val="VerbatimChar"/>
         </w:rPr>
-        <w:t xml:space="preserve">x_ssa_fed_compliance.arm</w:t>
+        <w:t xml:space="preserve">x_fed_compliance.arm</w:t>
       </w:r>
       <w:r>
         <w:t xml:space="preserve">, each with the MID Server selected, pointing at the in-boundary Graph and ARM endpoints (GCC/Gov cloud hosts per the tenant).</w:t>
@@ -1173,7 +1221,7 @@
         <w:rPr>
           <w:rStyle w:val="VerbatimChar"/>
         </w:rPr>
-        <w:t xml:space="preserve">x_ssa_fed_compliance.mid_server</w:t>
+        <w:t xml:space="preserve">x_fed_compliance.mid_server</w:t>
       </w:r>
       <w:r>
         <w:t xml:space="preserve">,</w:t>
@@ -1185,7 +1233,7 @@
         <w:rPr>
           <w:rStyle w:val="VerbatimChar"/>
         </w:rPr>
-        <w:t xml:space="preserve">x_ssa_fed_compliance.boundary</w:t>
+        <w:t xml:space="preserve">x_fed_compliance.boundary</w:t>
       </w:r>
       <w:r>
         <w:t xml:space="preserve"> </w:t>
@@ -1215,7 +1263,7 @@
         <w:rPr>
           <w:rStyle w:val="VerbatimChar"/>
         </w:rPr>
-        <w:t xml:space="preserve">x_ssa_fed_compliance.mid_scripts_dir</w:t>
+        <w:t xml:space="preserve">x_fed_compliance.mid_scripts_dir</w:t>
       </w:r>
       <w:r>
         <w:t xml:space="preserve">, and</w:t>
@@ -1227,7 +1275,7 @@
         <w:rPr>
           <w:rStyle w:val="VerbatimChar"/>
         </w:rPr>
-        <w:t xml:space="preserve">x_ssa_fed_compliance.acknowledge_saas_boundary</w:t>
+        <w:t xml:space="preserve">x_fed_compliance.acknowledge_saas_boundary</w:t>
       </w:r>
       <w:r>
         <w:t xml:space="preserve">. Under GCC Moderate the Graph and ARM callouts resolve to the commercial endpoints that serve the GCC Moderate boundary (</w:t>
@@ -1432,7 +1480,7 @@
         <w:pStyle w:val="Heading1"/>
       </w:pPr>
       <w:r>
-        <w:t xml:space="preserve">Boundary &amp; Governance</w:t>
+        <w:t xml:space="preserve">5. Boundary &amp; Governance</w:t>
       </w:r>
     </w:p>
     <w:p>
@@ -1478,7 +1526,7 @@
         <w:pStyle w:val="Heading1"/>
       </w:pPr>
       <w:r>
-        <w:t xml:space="preserve">The Control Map — Data, Checked Against the Spine</w:t>
+        <w:t xml:space="preserve">6. The Control Map — Data, Checked Against the Spine</w:t>
       </w:r>
     </w:p>
     <w:p>
@@ -1787,7 +1835,7 @@
         <w:pStyle w:val="Heading1"/>
       </w:pPr>
       <w:r>
-        <w:t xml:space="preserve">Closure Necessity</w:t>
+        <w:t xml:space="preserve">7. Closure Necessity</w:t>
       </w:r>
     </w:p>
     <w:bookmarkStart w:id="21" w:name="Xdda7303cf6bcdb390abe22e2da8986f6f03dcf5"/>
@@ -1796,7 +1844,7 @@
         <w:pStyle w:val="Heading2"/>
       </w:pPr>
       <w:r>
-        <w:t xml:space="preserve">Closure Necessity — the loop has to be an artifact, or it is a slideware promise</w:t>
+        <w:t xml:space="preserve">7.1 Closure Necessity — the loop has to be an artifact, or it is a slideware promise</w:t>
       </w:r>
     </w:p>
     <w:p>
@@ -1827,7 +1875,7 @@
         <w:pStyle w:val="Heading1"/>
       </w:pPr>
       <w:r>
-        <w:t xml:space="preserve">Honest Limits</w:t>
+        <w:t xml:space="preserve">8. Honest Limits</w:t>
       </w:r>
     </w:p>
     <w:p>
@@ -1901,7 +1949,7 @@
         <w:pStyle w:val="Heading1"/>
       </w:pPr>
       <w:r>
-        <w:t xml:space="preserve">Cross-References</w:t>
+        <w:t xml:space="preserve">9. Cross-References</w:t>
       </w:r>
     </w:p>
     <w:p>
@@ -2037,7 +2085,7 @@
         <w:pStyle w:val="Heading1"/>
       </w:pPr>
       <w:r>
-        <w:t xml:space="preserve">Provenance</w:t>
+        <w:t xml:space="preserve">10. Provenance</w:t>
       </w:r>
     </w:p>
     <w:p>
@@ -2054,10 +2102,10 @@
         <w:rPr>
           <w:rStyle w:val="VerbatimChar"/>
         </w:rPr>
-        <w:t xml:space="preserve">x_ssa_fed_compliance</w:t>
-      </w:r>
-      <w:r>
-        <w:t xml:space="preserve">, Microsoft Graph, and Azure Resource Manager are deployed examples; the in-boundary-MID, least-privilege-connector, control-map-checked-against-the-spine disciplines are the invariants. This is a vendor-integration skeleton independent of UIAO governance canon. The record-model figure is authored as committed house-style SVG (rasterized to PNG).</w:t>
+        <w:t xml:space="preserve">x_fed_compliance</w:t>
+      </w:r>
+      <w:r>
+        <w:t xml:space="preserve">, Microsoft Graph, and Azure Resource Manager are deployed examples; the in-boundary-MID, least-privilege-connector, control-map-checked-against-the-spine disciplines are the invariants. This is a vendor-integration skeleton independent of any governance engine’s canon. The record-model figure is authored as committed house-style SVG (rasterized to PNG).</w:t>
       </w:r>
     </w:p>
     <w:bookmarkEnd w:id="25"/>
@@ -3219,205 +3267,197 @@
     <w:name w:val="KeywordTok"/>
     <w:basedOn w:val="VerbatimChar"/>
     <w:rPr>
-      <w:b/>
-      <w:color w:val="007020"/>
+      <w:color w:val="d73a49"/>
     </w:rPr>
   </w:style>
   <w:style w:type="character" w:customStyle="1" w:styleId="DataTypeTok">
     <w:name w:val="DataTypeTok"/>
     <w:basedOn w:val="VerbatimChar"/>
     <w:rPr>
-      <w:color w:val="902000"/>
+      <w:color w:val="d73a49"/>
     </w:rPr>
   </w:style>
   <w:style w:type="character" w:customStyle="1" w:styleId="DecValTok">
     <w:name w:val="DecValTok"/>
     <w:basedOn w:val="VerbatimChar"/>
     <w:rPr>
-      <w:color w:val="40a070"/>
+      <w:color w:val="005cc5"/>
     </w:rPr>
   </w:style>
   <w:style w:type="character" w:customStyle="1" w:styleId="BaseNTok">
     <w:name w:val="BaseNTok"/>
     <w:basedOn w:val="VerbatimChar"/>
     <w:rPr>
-      <w:color w:val="40a070"/>
+      <w:color w:val="005cc5"/>
     </w:rPr>
   </w:style>
   <w:style w:type="character" w:customStyle="1" w:styleId="FloatTok">
     <w:name w:val="FloatTok"/>
     <w:basedOn w:val="VerbatimChar"/>
     <w:rPr>
-      <w:color w:val="40a070"/>
+      <w:color w:val="005cc5"/>
     </w:rPr>
   </w:style>
   <w:style w:type="character" w:customStyle="1" w:styleId="ConstantTok">
     <w:name w:val="ConstantTok"/>
     <w:basedOn w:val="VerbatimChar"/>
     <w:rPr>
-      <w:color w:val="880000"/>
+      <w:color w:val="005cc5"/>
     </w:rPr>
   </w:style>
   <w:style w:type="character" w:customStyle="1" w:styleId="CharTok">
     <w:name w:val="CharTok"/>
     <w:basedOn w:val="VerbatimChar"/>
     <w:rPr>
-      <w:color w:val="4070a0"/>
+      <w:color w:val="032f62"/>
     </w:rPr>
   </w:style>
   <w:style w:type="character" w:customStyle="1" w:styleId="SpecialCharTok">
     <w:name w:val="SpecialCharTok"/>
     <w:basedOn w:val="VerbatimChar"/>
     <w:rPr>
-      <w:color w:val="4070a0"/>
+      <w:color w:val="005cc5"/>
     </w:rPr>
   </w:style>
   <w:style w:type="character" w:customStyle="1" w:styleId="StringTok">
     <w:name w:val="StringTok"/>
     <w:basedOn w:val="VerbatimChar"/>
     <w:rPr>
-      <w:color w:val="4070a0"/>
+      <w:color w:val="032f62"/>
     </w:rPr>
   </w:style>
   <w:style w:type="character" w:customStyle="1" w:styleId="VerbatimStringTok">
     <w:name w:val="VerbatimStringTok"/>
     <w:basedOn w:val="VerbatimChar"/>
     <w:rPr>
-      <w:color w:val="4070a0"/>
+      <w:color w:val="032f62"/>
     </w:rPr>
   </w:style>
   <w:style w:type="character" w:customStyle="1" w:styleId="SpecialStringTok">
     <w:name w:val="SpecialStringTok"/>
     <w:basedOn w:val="VerbatimChar"/>
     <w:rPr>
-      <w:color w:val="bb6688"/>
+      <w:color w:val="032f62"/>
     </w:rPr>
   </w:style>
   <w:style w:type="character" w:customStyle="1" w:styleId="ImportTok">
     <w:name w:val="ImportTok"/>
     <w:basedOn w:val="VerbatimChar"/>
     <w:rPr>
-      <w:b/>
-      <w:color w:val="008000"/>
+      <w:color w:val="032f62"/>
     </w:rPr>
   </w:style>
   <w:style w:type="character" w:customStyle="1" w:styleId="CommentTok">
     <w:name w:val="CommentTok"/>
     <w:basedOn w:val="VerbatimChar"/>
     <w:rPr>
-      <w:i/>
-      <w:color w:val="60a0b0"/>
+      <w:color w:val="6a737d"/>
     </w:rPr>
   </w:style>
   <w:style w:type="character" w:customStyle="1" w:styleId="DocumentationTok">
     <w:name w:val="DocumentationTok"/>
     <w:basedOn w:val="VerbatimChar"/>
     <w:rPr>
-      <w:i/>
-      <w:color w:val="ba2121"/>
+      <w:color w:val="6a737d"/>
     </w:rPr>
   </w:style>
   <w:style w:type="character" w:customStyle="1" w:styleId="AnnotationTok">
     <w:name w:val="AnnotationTok"/>
     <w:basedOn w:val="VerbatimChar"/>
     <w:rPr>
-      <w:b/>
-      <w:i/>
-      <w:color w:val="60a0b0"/>
+      <w:color w:val="6a737d"/>
     </w:rPr>
   </w:style>
   <w:style w:type="character" w:customStyle="1" w:styleId="CommentVarTok">
     <w:name w:val="CommentVarTok"/>
     <w:basedOn w:val="VerbatimChar"/>
     <w:rPr>
-      <w:b/>
-      <w:i/>
-      <w:color w:val="60a0b0"/>
+      <w:color w:val="6a737d"/>
     </w:rPr>
   </w:style>
   <w:style w:type="character" w:customStyle="1" w:styleId="OtherTok">
     <w:name w:val="OtherTok"/>
     <w:basedOn w:val="VerbatimChar"/>
     <w:rPr>
-      <w:color w:val="007020"/>
+      <w:color w:val="6f42c1"/>
     </w:rPr>
   </w:style>
   <w:style w:type="character" w:customStyle="1" w:styleId="FunctionTok">
     <w:name w:val="FunctionTok"/>
     <w:basedOn w:val="VerbatimChar"/>
     <w:rPr>
-      <w:color w:val="06287e"/>
+      <w:color w:val="6f42c1"/>
     </w:rPr>
   </w:style>
   <w:style w:type="character" w:customStyle="1" w:styleId="VariableTok">
     <w:name w:val="VariableTok"/>
     <w:basedOn w:val="VerbatimChar"/>
     <w:rPr>
-      <w:color w:val="19177c"/>
+      <w:color w:val="e36209"/>
     </w:rPr>
   </w:style>
   <w:style w:type="character" w:customStyle="1" w:styleId="ControlFlowTok">
     <w:name w:val="ControlFlowTok"/>
     <w:basedOn w:val="VerbatimChar"/>
     <w:rPr>
-      <w:b/>
-      <w:color w:val="007020"/>
+      <w:color w:val="d73a49"/>
     </w:rPr>
   </w:style>
   <w:style w:type="character" w:customStyle="1" w:styleId="OperatorTok">
     <w:name w:val="OperatorTok"/>
     <w:basedOn w:val="VerbatimChar"/>
     <w:rPr>
-      <w:color w:val="666666"/>
+      <w:color w:val="24292e"/>
     </w:rPr>
   </w:style>
   <w:style w:type="character" w:customStyle="1" w:styleId="BuiltInTok">
     <w:name w:val="BuiltInTok"/>
     <w:basedOn w:val="VerbatimChar"/>
     <w:rPr>
-      <w:color w:val="008000"/>
+      <w:color w:val="d73a49"/>
     </w:rPr>
   </w:style>
   <w:style w:type="character" w:customStyle="1" w:styleId="ExtensionTok">
     <w:name w:val="ExtensionTok"/>
     <w:basedOn w:val="VerbatimChar"/>
-    <w:rPr/>
+    <w:rPr>
+      <w:b/>
+      <w:color w:val="d73a49"/>
+    </w:rPr>
   </w:style>
   <w:style w:type="character" w:customStyle="1" w:styleId="PreprocessorTok">
     <w:name w:val="PreprocessorTok"/>
     <w:basedOn w:val="VerbatimChar"/>
     <w:rPr>
-      <w:color w:val="bc7a00"/>
+      <w:color w:val="d73a49"/>
     </w:rPr>
   </w:style>
   <w:style w:type="character" w:customStyle="1" w:styleId="AttributeTok">
     <w:name w:val="AttributeTok"/>
     <w:basedOn w:val="VerbatimChar"/>
     <w:rPr>
-      <w:color w:val="7d9029"/>
+      <w:color w:val="d73a49"/>
     </w:rPr>
   </w:style>
   <w:style w:type="character" w:customStyle="1" w:styleId="RegionMarkerTok">
     <w:name w:val="RegionMarkerTok"/>
     <w:basedOn w:val="VerbatimChar"/>
-    <w:rPr/>
+    <w:rPr>
+      <w:color w:val="6a737d"/>
+    </w:rPr>
   </w:style>
   <w:style w:type="character" w:customStyle="1" w:styleId="InformationTok">
     <w:name w:val="InformationTok"/>
     <w:basedOn w:val="VerbatimChar"/>
     <w:rPr>
-      <w:b/>
-      <w:i/>
-      <w:color w:val="60a0b0"/>
+      <w:color w:val="6a737d"/>
     </w:rPr>
   </w:style>
   <w:style w:type="character" w:customStyle="1" w:styleId="WarningTok">
     <w:name w:val="WarningTok"/>
     <w:basedOn w:val="VerbatimChar"/>
     <w:rPr>
-      <w:b/>
-      <w:i/>
-      <w:color w:val="60a0b0"/>
+      <w:color w:val="ff5555"/>
     </w:rPr>
   </w:style>
   <w:style w:type="character" w:customStyle="1" w:styleId="AlertTok">
@@ -3425,21 +3465,23 @@
     <w:basedOn w:val="VerbatimChar"/>
     <w:rPr>
       <w:b/>
-      <w:color w:val="ff0000"/>
+      <w:color w:val="ff5555"/>
     </w:rPr>
   </w:style>
   <w:style w:type="character" w:customStyle="1" w:styleId="ErrorTok">
     <w:name w:val="ErrorTok"/>
     <w:basedOn w:val="VerbatimChar"/>
     <w:rPr>
-      <w:b/>
-      <w:color w:val="ff0000"/>
+      <w:color w:val="ff5555"/>
+      <w:u/>
     </w:rPr>
   </w:style>
   <w:style w:type="character" w:customStyle="1" w:styleId="NormalTok">
     <w:name w:val="NormalTok"/>
     <w:basedOn w:val="VerbatimChar"/>
-    <w:rPr/>
+    <w:rPr>
+      <w:color w:val="24292e"/>
+    </w:rPr>
   </w:style>
 </w:styles>
 </file>

</xml_diff>